<commit_message>
Release v1.0.0: Vietnamese templates and Windows packaging
</commit_message>
<xml_diff>
--- a/app-data/templates/vietnam/bao_cao.docx
+++ b/app-data/templates/vietnam/bao_cao.docx
@@ -9,13 +9,13 @@
         <w:tblLook w:firstColumn="1" w:firstRow="1" w:lastColumn="0" w:lastRow="0" w:noHBand="0" w:noVBand="1" w:val="04A0"/>
       </w:tblPr>
       <w:tblGrid>
-        <w:gridCol w:w="4703"/>
-        <w:gridCol w:w="4703"/>
+        <w:gridCol w:w="4535"/>
+        <w:gridCol w:w="4535"/>
       </w:tblGrid>
       <w:tr>
         <w:tc>
           <w:tcPr>
-            <w:tcW w:type="dxa" w:w="4703"/>
+            <w:tcW w:type="dxa" w:w="4535"/>
           </w:tcPr>
           <w:p>
             <w:pPr>
@@ -24,7 +24,7 @@
             <w:r>
               <w:rPr>
                 <w:rFonts w:ascii="Times New Roman" w:hAnsi="Times New Roman"/>
-                <w:sz w:val="24"/>
+                <w:sz w:val="22"/>
               </w:rPr>
               <w:t>{{issuing_authority}}</w:t>
               <w:br/>
@@ -34,7 +34,7 @@
         </w:tc>
         <w:tc>
           <w:tcPr>
-            <w:tcW w:type="dxa" w:w="4703"/>
+            <w:tcW w:type="dxa" w:w="4535"/>
           </w:tcPr>
           <w:p>
             <w:pPr>
@@ -43,7 +43,7 @@
             <w:r>
               <w:rPr>
                 <w:rFonts w:ascii="Times New Roman" w:hAnsi="Times New Roman"/>
-                <w:sz w:val="24"/>
+                <w:sz w:val="22"/>
               </w:rPr>
               <w:t>CỘNG HÒA XÃ HỘI CHỦ NGHĨA VIỆT NAM</w:t>
               <w:br/>
@@ -139,13 +139,13 @@
         <w:tblLook w:firstColumn="1" w:firstRow="1" w:lastColumn="0" w:lastRow="0" w:noHBand="0" w:noVBand="1" w:val="04A0"/>
       </w:tblPr>
       <w:tblGrid>
-        <w:gridCol w:w="4703"/>
-        <w:gridCol w:w="4703"/>
+        <w:gridCol w:w="4535"/>
+        <w:gridCol w:w="4535"/>
       </w:tblGrid>
       <w:tr>
         <w:tc>
           <w:tcPr>
-            <w:tcW w:type="dxa" w:w="4703"/>
+            <w:tcW w:type="dxa" w:w="4535"/>
           </w:tcPr>
           <w:p>
             <w:pPr>
@@ -162,7 +162,7 @@
         </w:tc>
         <w:tc>
           <w:tcPr>
-            <w:tcW w:type="dxa" w:w="4703"/>
+            <w:tcW w:type="dxa" w:w="4535"/>
           </w:tcPr>
           <w:p>
             <w:pPr>
@@ -180,8 +180,8 @@
       </w:tr>
     </w:tbl>
     <w:sectPr>
-      <w:pgSz w:w="12240" w:h="15840"/>
-      <w:pgMar w:top="1134" w:right="1134" w:bottom="1134" w:left="1700" w:header="720" w:footer="720" w:gutter="0"/>
+      <w:pgSz w:w="11906" w:h="16838"/>
+      <w:pgMar w:top="1134" w:right="1134" w:bottom="1134" w:left="1701" w:header="720" w:footer="720" w:gutter="0"/>
       <w:cols w:space="720"/>
       <w:docGrid w:linePitch="360"/>
     </w:sectPr>

</xml_diff>